<commit_message>
Feat: Tich hop giao dien GUI hien dai, cap nhat README va bao cao thuyet minh
</commit_message>
<xml_diff>
--- a/BaoCao_NhomG22.docx
+++ b/BaoCao_NhomG22.docx
@@ -715,6 +715,31 @@
       <w:r>
         <w:rPr>
           <w:rFonts w:ascii="Times New Roman" w:hAnsi="Times New Roman"/>
+          <w:b w:val="0"/>
+          <w:sz w:val="24"/>
+        </w:rPr>
+        <w:t xml:space="preserve">    1.4. Hướng dẫn chạy chương trình</w:t>
+      </w:r>
+      <w:r>
+        <w:rPr>
+          <w:rFonts w:ascii="Times New Roman" w:hAnsi="Times New Roman"/>
+          <w:b w:val="0"/>
+          <w:sz w:val="24"/>
+        </w:rPr>
+        <w:tab/>
+        <w:t>5</w:t>
+      </w:r>
+    </w:p>
+    <w:p>
+      <w:pPr>
+        <w:tabs>
+          <w:tab w:pos="8504" w:val="right" w:leader="dot"/>
+        </w:tabs>
+        <w:spacing w:after="80" w:before="40" w:line="276" w:lineRule="auto"/>
+      </w:pPr>
+      <w:r>
+        <w:rPr>
+          <w:rFonts w:ascii="Times New Roman" w:hAnsi="Times New Roman"/>
           <w:b/>
           <w:sz w:val="24"/>
         </w:rPr>
@@ -1781,6 +1806,331 @@
       </w:hyperlink>
     </w:p>
     <w:p>
+      <w:pPr>
+        <w:pStyle w:val="Heading2"/>
+        <w:spacing w:line="276" w:lineRule="auto" w:after="120" w:before="240"/>
+        <w:jc w:val="left"/>
+      </w:pPr>
+      <w:r>
+        <w:rPr>
+          <w:rFonts w:ascii="Times New Roman" w:hAnsi="Times New Roman"/>
+          <w:b/>
+          <w:i w:val="0"/>
+          <w:sz w:val="28"/>
+        </w:rPr>
+        <w:t>1.4. Hướng dẫn chạy chương trình</w:t>
+      </w:r>
+    </w:p>
+    <w:p>
+      <w:pPr>
+        <w:spacing w:line="360" w:lineRule="auto" w:after="120" w:before="0"/>
+        <w:jc w:val="both"/>
+      </w:pPr>
+      <w:r>
+        <w:rPr>
+          <w:rFonts w:ascii="Times New Roman" w:hAnsi="Times New Roman"/>
+          <w:b w:val="0"/>
+          <w:i w:val="0"/>
+          <w:sz w:val="26"/>
+        </w:rPr>
+        <w:t>Hệ thống quản lý kho hàng hỗ trợ hai phương thức vận hành: Giao diện đồ họa (GUI) trực quan và giao diện dòng lệnh (CLI) truyền thống.</w:t>
+      </w:r>
+    </w:p>
+    <w:p>
+      <w:pPr>
+        <w:pStyle w:val="Heading3"/>
+        <w:spacing w:line="276" w:lineRule="auto" w:after="120" w:before="240"/>
+        <w:jc w:val="left"/>
+      </w:pPr>
+      <w:r>
+        <w:rPr>
+          <w:rFonts w:ascii="Times New Roman" w:hAnsi="Times New Roman"/>
+          <w:b/>
+          <w:i w:val="0"/>
+          <w:sz w:val="24"/>
+        </w:rPr>
+        <w:t>1.4.1. Chuẩn bị môi trường</w:t>
+      </w:r>
+    </w:p>
+    <w:p>
+      <w:pPr>
+        <w:spacing w:line="360" w:lineRule="auto" w:after="120" w:before="0"/>
+        <w:jc w:val="both"/>
+      </w:pPr>
+      <w:r>
+        <w:rPr>
+          <w:rFonts w:ascii="Times New Roman" w:hAnsi="Times New Roman"/>
+          <w:b w:val="0"/>
+          <w:i w:val="0"/>
+          <w:sz w:val="26"/>
+        </w:rPr>
+        <w:t>- Hệ điều hành: Windows, macOS, Linux.</w:t>
+      </w:r>
+    </w:p>
+    <w:p>
+      <w:pPr>
+        <w:spacing w:line="360" w:lineRule="auto" w:after="120" w:before="0"/>
+        <w:jc w:val="both"/>
+      </w:pPr>
+      <w:r>
+        <w:rPr>
+          <w:rFonts w:ascii="Times New Roman" w:hAnsi="Times New Roman"/>
+          <w:b w:val="0"/>
+          <w:i w:val="0"/>
+          <w:sz w:val="26"/>
+        </w:rPr>
+        <w:t>- Phiên bản ngôn ngữ: Python 3.7 trở lên.</w:t>
+      </w:r>
+    </w:p>
+    <w:p>
+      <w:pPr>
+        <w:spacing w:line="360" w:lineRule="auto" w:after="120" w:before="0"/>
+        <w:jc w:val="both"/>
+      </w:pPr>
+      <w:r>
+        <w:rPr>
+          <w:rFonts w:ascii="Times New Roman" w:hAnsi="Times New Roman"/>
+          <w:b w:val="0"/>
+          <w:i w:val="0"/>
+          <w:sz w:val="26"/>
+        </w:rPr>
+        <w:t>- Thư viện phụ thuộc: Hệ thống sử dụng thư viện đồ họa chuẩn tkinter tích hợp sẵn trong Python. Để hiển thị logo của trường Đại học Bách Khoa Hà Nội trên thanh menu của giao diện GUI, hệ thống sử dụng thư viện xử lý ảnh Pillow. Cài đặt thư viện bằng lệnh:</w:t>
+      </w:r>
+    </w:p>
+    <w:tbl>
+      <w:tblPr>
+        <w:tblW w:type="auto" w:w="0"/>
+        <w:tblLayout w:type="fixed"/>
+        <w:tblLook w:firstColumn="1" w:firstRow="1" w:lastColumn="0" w:lastRow="0" w:noHBand="0" w:noVBand="1" w:val="04A0"/>
+      </w:tblPr>
+      <w:tblGrid>
+        <w:gridCol w:w="9405"/>
+      </w:tblGrid>
+      <w:tr>
+        <w:tc>
+          <w:tcPr>
+            <w:shd w:fill="F5F5F5"/>
+            <w:tcMar>
+              <w:top w:w="100" w:type="dxa"/>
+              <w:bottom w:w="100" w:type="dxa"/>
+              <w:left w:w="150" w:type="dxa"/>
+              <w:right w:w="150" w:type="dxa"/>
+            </w:tcMar>
+            <w:tcBorders>
+              <w:top w:val="single" w:sz="4" w:space="0" w:color="D3D3D3"/>
+              <w:left w:val="single" w:sz="4" w:space="0" w:color="D3D3D3"/>
+              <w:bottom w:val="single" w:sz="4" w:space="0" w:color="D3D3D3"/>
+              <w:right w:val="single" w:sz="4" w:space="0" w:color="D3D3D3"/>
+            </w:tcBorders>
+            <w:tcW w:w="9072" w:type="dxa"/>
+          </w:tcPr>
+          <w:p>
+            <w:pPr>
+              <w:spacing w:before="80" w:after="80" w:line="240" w:lineRule="auto"/>
+            </w:pPr>
+            <w:r>
+              <w:rPr>
+                <w:rFonts w:ascii="Consolas" w:hAnsi="Consolas"/>
+                <w:sz w:val="20"/>
+              </w:rPr>
+              <w:t>pip install Pillow</w:t>
+            </w:r>
+          </w:p>
+        </w:tc>
+      </w:tr>
+    </w:tbl>
+    <w:p>
+      <w:pPr>
+        <w:spacing w:line="360" w:lineRule="auto" w:after="120" w:before="0"/>
+        <w:jc w:val="both"/>
+      </w:pPr>
+      <w:r>
+        <w:rPr>
+          <w:rFonts w:ascii="Times New Roman" w:hAnsi="Times New Roman"/>
+          <w:b w:val="0"/>
+          <w:i w:val="0"/>
+          <w:sz w:val="26"/>
+        </w:rPr>
+        <w:t>(Lưu ý: Nếu hệ thống không cài đặt thư viện Pillow, chương trình sẽ tự động bỏ qua logo và khởi động bình thường mà không gây ra bất kỳ lỗi runtime nào).</w:t>
+      </w:r>
+    </w:p>
+    <w:p>
+      <w:pPr>
+        <w:pStyle w:val="Heading3"/>
+        <w:spacing w:line="276" w:lineRule="auto" w:after="120" w:before="240"/>
+        <w:jc w:val="left"/>
+      </w:pPr>
+      <w:r>
+        <w:rPr>
+          <w:rFonts w:ascii="Times New Roman" w:hAnsi="Times New Roman"/>
+          <w:b/>
+          <w:i w:val="0"/>
+          <w:sz w:val="24"/>
+        </w:rPr>
+        <w:t>1.4.2. Khởi chạy giao diện đồ họa (GUI - Mặc định)</w:t>
+      </w:r>
+    </w:p>
+    <w:p>
+      <w:pPr>
+        <w:spacing w:line="360" w:lineRule="auto" w:after="120" w:before="0"/>
+        <w:jc w:val="both"/>
+      </w:pPr>
+      <w:r>
+        <w:rPr>
+          <w:rFonts w:ascii="Times New Roman" w:hAnsi="Times New Roman"/>
+          <w:b w:val="0"/>
+          <w:i w:val="0"/>
+          <w:sz w:val="26"/>
+        </w:rPr>
+        <w:t>Để khởi chạy giao diện đồ họa hiện đại với các biểu đồ tổng quan, bảng biểu danh mục và biểu mẫu nhập xuất trực quan, người dùng chạy lệnh sau từ thư mục gốc của dự án:</w:t>
+      </w:r>
+    </w:p>
+    <w:tbl>
+      <w:tblPr>
+        <w:tblW w:type="auto" w:w="0"/>
+        <w:tblLayout w:type="fixed"/>
+        <w:tblLook w:firstColumn="1" w:firstRow="1" w:lastColumn="0" w:lastRow="0" w:noHBand="0" w:noVBand="1" w:val="04A0"/>
+      </w:tblPr>
+      <w:tblGrid>
+        <w:gridCol w:w="9405"/>
+      </w:tblGrid>
+      <w:tr>
+        <w:tc>
+          <w:tcPr>
+            <w:shd w:fill="F5F5F5"/>
+            <w:tcMar>
+              <w:top w:w="100" w:type="dxa"/>
+              <w:bottom w:w="100" w:type="dxa"/>
+              <w:left w:w="150" w:type="dxa"/>
+              <w:right w:w="150" w:type="dxa"/>
+            </w:tcMar>
+            <w:tcBorders>
+              <w:top w:val="single" w:sz="4" w:space="0" w:color="D3D3D3"/>
+              <w:left w:val="single" w:sz="4" w:space="0" w:color="D3D3D3"/>
+              <w:bottom w:val="single" w:sz="4" w:space="0" w:color="D3D3D3"/>
+              <w:right w:val="single" w:sz="4" w:space="0" w:color="D3D3D3"/>
+            </w:tcBorders>
+            <w:tcW w:w="9072" w:type="dxa"/>
+          </w:tcPr>
+          <w:p>
+            <w:pPr>
+              <w:spacing w:before="80" w:after="80" w:line="240" w:lineRule="auto"/>
+            </w:pPr>
+            <w:r>
+              <w:rPr>
+                <w:rFonts w:ascii="Consolas" w:hAnsi="Consolas"/>
+                <w:sz w:val="20"/>
+              </w:rPr>
+              <w:t>python src/main.py</w:t>
+            </w:r>
+          </w:p>
+        </w:tc>
+      </w:tr>
+    </w:tbl>
+    <w:p>
+      <w:pPr>
+        <w:spacing w:line="360" w:lineRule="auto" w:after="120" w:before="0"/>
+        <w:jc w:val="both"/>
+      </w:pPr>
+      <w:r>
+        <w:rPr>
+          <w:rFonts w:ascii="Times New Roman" w:hAnsi="Times New Roman"/>
+          <w:b w:val="0"/>
+          <w:i w:val="0"/>
+          <w:sz w:val="26"/>
+        </w:rPr>
+        <w:t>Hệ thống sẽ tự động phát hiện môi trường đồ họa để hiển thị cửa sổ làm việc chính của chương trình.</w:t>
+      </w:r>
+    </w:p>
+    <w:p>
+      <w:pPr>
+        <w:pStyle w:val="Heading3"/>
+        <w:spacing w:line="276" w:lineRule="auto" w:after="120" w:before="240"/>
+        <w:jc w:val="left"/>
+      </w:pPr>
+      <w:r>
+        <w:rPr>
+          <w:rFonts w:ascii="Times New Roman" w:hAnsi="Times New Roman"/>
+          <w:b/>
+          <w:i w:val="0"/>
+          <w:sz w:val="24"/>
+        </w:rPr>
+        <w:t>1.4.3. Khởi chạy giao diện dòng lệnh (CLI)</w:t>
+      </w:r>
+    </w:p>
+    <w:p>
+      <w:pPr>
+        <w:spacing w:line="360" w:lineRule="auto" w:after="120" w:before="0"/>
+        <w:jc w:val="both"/>
+      </w:pPr>
+      <w:r>
+        <w:rPr>
+          <w:rFonts w:ascii="Times New Roman" w:hAnsi="Times New Roman"/>
+          <w:b w:val="0"/>
+          <w:i w:val="0"/>
+          <w:sz w:val="26"/>
+        </w:rPr>
+        <w:t>Trong trường hợp vận hành trên máy chủ không có giao diện màn hình (headless) hoặc người dùng muốn sử dụng phiên bản console truyền thống, có thể truyền thêm tham số --console:</w:t>
+      </w:r>
+    </w:p>
+    <w:tbl>
+      <w:tblPr>
+        <w:tblW w:type="auto" w:w="0"/>
+        <w:tblLayout w:type="fixed"/>
+        <w:tblLook w:firstColumn="1" w:firstRow="1" w:lastColumn="0" w:lastRow="0" w:noHBand="0" w:noVBand="1" w:val="04A0"/>
+      </w:tblPr>
+      <w:tblGrid>
+        <w:gridCol w:w="9405"/>
+      </w:tblGrid>
+      <w:tr>
+        <w:tc>
+          <w:tcPr>
+            <w:shd w:fill="F5F5F5"/>
+            <w:tcMar>
+              <w:top w:w="100" w:type="dxa"/>
+              <w:bottom w:w="100" w:type="dxa"/>
+              <w:left w:w="150" w:type="dxa"/>
+              <w:right w:w="150" w:type="dxa"/>
+            </w:tcMar>
+            <w:tcBorders>
+              <w:top w:val="single" w:sz="4" w:space="0" w:color="D3D3D3"/>
+              <w:left w:val="single" w:sz="4" w:space="0" w:color="D3D3D3"/>
+              <w:bottom w:val="single" w:sz="4" w:space="0" w:color="D3D3D3"/>
+              <w:right w:val="single" w:sz="4" w:space="0" w:color="D3D3D3"/>
+            </w:tcBorders>
+            <w:tcW w:w="9072" w:type="dxa"/>
+          </w:tcPr>
+          <w:p>
+            <w:pPr>
+              <w:spacing w:before="80" w:after="80" w:line="240" w:lineRule="auto"/>
+            </w:pPr>
+            <w:r>
+              <w:rPr>
+                <w:rFonts w:ascii="Consolas" w:hAnsi="Consolas"/>
+                <w:sz w:val="20"/>
+              </w:rPr>
+              <w:t>python src/main.py --console</w:t>
+            </w:r>
+          </w:p>
+        </w:tc>
+      </w:tr>
+    </w:tbl>
+    <w:p>
+      <w:pPr>
+        <w:spacing w:line="360" w:lineRule="auto" w:after="120" w:before="0"/>
+        <w:jc w:val="both"/>
+      </w:pPr>
+      <w:r>
+        <w:rPr>
+          <w:rFonts w:ascii="Times New Roman" w:hAnsi="Times New Roman"/>
+          <w:b w:val="0"/>
+          <w:i w:val="0"/>
+          <w:sz w:val="26"/>
+        </w:rPr>
+        <w:t>Ở chế độ này, người dùng sẽ tương tác thông qua các số lựa chọn từ menu văn bản trên terminal.</w:t>
+      </w:r>
+    </w:p>
+    <w:p>
       <w:r>
         <w:br w:type="page"/>
       </w:r>
@@ -1829,7 +2179,7 @@
           <w:i w:val="0"/>
           <w:sz w:val="26"/>
         </w:rPr>
-        <w:t>Hệ thống Quản lý Kho Hàng (Warehouse Management System) là một ứng dụng console gọn nhẹ viết bằng ngôn ngữ lập trình Python 3. Ứng dụng cung cấp các công cụ thiết thực giúp nhân viên thủ kho quản lý toàn diện vòng đời của sản phẩm bao gồm nhập kho, xuất kho, kiểm kê và lập báo cáo. Để tuân thủ đúng yêu cầu của học phần Kỹ thuật Lập trình, hệ thống không sử dụng các cơ sở dữ liệu bên ngoài hay các cấu trúc dữ liệu và thư viện nâng cao có sẵn của nền tảng (như các hàm sort, các cấu trúc set, queue nâng cao). Thay vào đó, toàn bộ các cấu trúc dữ liệu cơ bản và thuật toán xử lý nghiệp vụ đều được tự thiết kế và cài đặt từ đầu.</w:t>
+        <w:t>Hệ thống Quản lý Kho Hàng (Warehouse Management System) hỗ trợ hai giao diện vận hành linh hoạt bao gồm giao diện đồ họa trực quan (GUI) hiện đại và giao diện dòng lệnh truyền thống (CLI) được viết bằng ngôn ngữ lập trình Python 3. Ứng dụng cung cấp các công cụ thiết thực giúp nhân viên thủ kho quản lý toàn diện vòng đời của sản phẩm bao gồm nhập kho, xuất kho, kiểm kê và lập báo cáo. Để tuân thủ đúng yêu cầu của học phần Kỹ thuật Lập trình, hệ thống không sử dụng các cơ sở dữ liệu bên ngoài hay các cấu trúc dữ liệu và thư viện nâng cao có sẵn của nền tảng (như các hàm sort, các cấu trúc set, queue nâng cao). Thay vào đó, toàn bộ các cấu trúc dữ liệu cơ bản và thuật toán xử lý nghiệp vụ đều được tự thiết kế và cài đặt từ đầu.</w:t>
       </w:r>
     </w:p>
     <w:p>
@@ -2300,6 +2650,68 @@
                 <w:sz w:val="22"/>
               </w:rPr>
               <w:t>Chứa vòng lặp Event Loop chính, hiển thị menu cấp 1 và cấp 2, điều hướng các lựa chọn của người dùng.</w:t>
+            </w:r>
+          </w:p>
+        </w:tc>
+      </w:tr>
+      <w:tr>
+        <w:tc>
+          <w:tcPr>
+            <w:tcW w:w="1417" w:type="dxa"/>
+          </w:tcPr>
+          <w:p>
+            <w:pPr>
+              <w:spacing w:line="360" w:lineRule="auto" w:after="120" w:before="0"/>
+              <w:jc w:val="left"/>
+            </w:pPr>
+            <w:r>
+              <w:rPr>
+                <w:rFonts w:ascii="Times New Roman" w:hAnsi="Times New Roman"/>
+                <w:b w:val="0"/>
+                <w:i w:val="0"/>
+                <w:sz w:val="22"/>
+              </w:rPr>
+              <w:t>gui.py</w:t>
+            </w:r>
+          </w:p>
+        </w:tc>
+        <w:tc>
+          <w:tcPr>
+            <w:tcW w:w="2551" w:type="dxa"/>
+          </w:tcPr>
+          <w:p>
+            <w:pPr>
+              <w:spacing w:line="360" w:lineRule="auto" w:after="120" w:before="0"/>
+              <w:jc w:val="left"/>
+            </w:pPr>
+            <w:r>
+              <w:rPr>
+                <w:rFonts w:ascii="Times New Roman" w:hAnsi="Times New Roman"/>
+                <w:b w:val="0"/>
+                <w:i w:val="0"/>
+                <w:sz w:val="22"/>
+              </w:rPr>
+              <w:t>Giao diện đồ họa người dùng (GUI)</w:t>
+            </w:r>
+          </w:p>
+        </w:tc>
+        <w:tc>
+          <w:tcPr>
+            <w:tcW w:w="5103" w:type="dxa"/>
+          </w:tcPr>
+          <w:p>
+            <w:pPr>
+              <w:spacing w:line="360" w:lineRule="auto" w:after="120" w:before="0"/>
+              <w:jc w:val="left"/>
+            </w:pPr>
+            <w:r>
+              <w:rPr>
+                <w:rFonts w:ascii="Times New Roman" w:hAnsi="Times New Roman"/>
+                <w:b w:val="0"/>
+                <w:i w:val="0"/>
+                <w:sz w:val="22"/>
+              </w:rPr>
+              <w:t>Được xây dựng trên nền tảng Tkinter/ttk, cung cấp giao diện đồ họa trực quan bao gồm các view: Tổng quan (Dashboard), Danh mục sản phẩm (Product), Nhập/Xuất kho (Transaction), Tìm kiếm &amp; Lọc (Search), Báo cáo &amp; Thống kê (Report). Hỗ trợ Dark Mode và các hiệu ứng phản hồi hover.</w:t>
             </w:r>
           </w:p>
         </w:tc>

</xml_diff>

<commit_message>
Docs: Cap nhat huong dan cai dat bang requirements.txt trong bao cao
</commit_message>
<xml_diff>
--- a/BaoCao_NhomG22.docx
+++ b/BaoCao_NhomG22.docx
@@ -1894,7 +1894,7 @@
           <w:i w:val="0"/>
           <w:sz w:val="26"/>
         </w:rPr>
-        <w:t>- Thư viện phụ thuộc: Hệ thống sử dụng thư viện đồ họa chuẩn tkinter tích hợp sẵn trong Python. Để hiển thị logo của trường Đại học Bách Khoa Hà Nội trên thanh menu của giao diện GUI, hệ thống sử dụng thư viện xử lý ảnh Pillow. Cài đặt thư viện bằng lệnh:</w:t>
+        <w:t>- Thư viện phụ thuộc: Hệ thống sử dụng thư viện đồ họa chuẩn tkinter tích hợp sẵn trong Python. Để hiển thị logo của trường Đại học Bách Khoa Hà Nội trên thanh menu của giao diện GUI, hệ thống sử dụng thư viện xử lý ảnh Pillow. Cài đặt các thư viện cần thiết thông qua tệp requirements.txt ở thư mục gốc của dự án:</w:t>
       </w:r>
     </w:p>
     <w:tbl>
@@ -1933,7 +1933,7 @@
                 <w:rFonts w:ascii="Consolas" w:hAnsi="Consolas"/>
                 <w:sz w:val="20"/>
               </w:rPr>
-              <w:t>pip install Pillow</w:t>
+              <w:t>pip install -r requirements.txt</w:t>
             </w:r>
           </w:p>
         </w:tc>

</xml_diff>

<commit_message>
Feat: Bo sung unit tests va cap nhat huong dan kiem thu vao README & BaoCao
</commit_message>
<xml_diff>
--- a/BaoCao_NhomG22.docx
+++ b/BaoCao_NhomG22.docx
@@ -2129,6 +2129,68 @@
         </w:rPr>
         <w:t>Ở chế độ này, người dùng sẽ tương tác thông qua các số lựa chọn từ menu văn bản trên terminal.</w:t>
       </w:r>
+    </w:p>
+    <w:p>
+      <w:pPr>
+        <w:pStyle w:val="Heading3"/>
+        <w:keepNext/>
+        <w:spacing w:before="240" w:after="120"/>
+      </w:pPr>
+      <w:r>
+        <w:rPr>
+          <w:rFonts w:ascii="Times New Roman" w:hAnsi="Times New Roman" w:cs="Times New Roman"/>
+          <w:b/>
+          <w:i w:val="0"/>
+          <w:sz w:val="24"/>
+        </w:rPr>
+        <w:t>1.4.4. Khởi chạy các tệp kiểm thử tự động (Unit Tests)</w:t>
+      </w:r>
+    </w:p>
+    <w:p>
+      <w:pPr>
+        <w:spacing w:before="120" w:after="120"/>
+      </w:pPr>
+      <w:r>
+        <w:rPr>
+          <w:rFonts w:ascii="Times New Roman" w:hAnsi="Times New Roman" w:cs="Times New Roman"/>
+          <w:b w:val="0"/>
+          <w:i w:val="0"/>
+          <w:sz w:val="26"/>
+        </w:rPr>
+        <w:t>Để kiểm tra tính đúng đắn của toàn bộ hệ thống (các mô hình dữ liệu, lưu trữ, thuật toán tìm kiếm và sắp xếp), nhóm G22 đã xây dựng bộ kiểm thử tự động toàn diện sử dụng thư viện tiêu chuẩn unittest của Python. Thủ kho hoặc kiểm thử viên có thể chạy bộ kiểm thử này từ thư mục gốc của dự án bằng lệnh:</w:t>
+      </w:r>
+    </w:p>
+    <w:p>
+      <w:pPr>
+        <w:spacing w:before="120" w:after="120"/>
+        <w:ind w:left="720"/>
+      </w:pPr>
+      <w:r>
+        <w:rPr>
+          <w:rFonts w:ascii="Courier New" w:hAnsi="Courier New" w:cs="Courier New"/>
+          <w:b/>
+          <w:i w:val="0"/>
+          <w:sz w:val="21"/>
+        </w:rPr>
+        <w:t>python run_tests.py</w:t>
+      </w:r>
+    </w:p>
+    <w:p>
+      <w:pPr>
+        <w:spacing w:before="120" w:after="240"/>
+      </w:pPr>
+      <w:r>
+        <w:rPr>
+          <w:rFonts w:ascii="Times New Roman" w:hAnsi="Times New Roman" w:cs="Times New Roman"/>
+          <w:b w:val="0"/>
+          <w:i w:val="0"/>
+          <w:sz w:val="26"/>
+        </w:rPr>
+        <w:t>Bộ kiểm thử sẽ tự động phát hiện và chạy tất cả 29 ca kiểm thử trong thư mục tests/, báo cáo trực quan số lượng ca thành công/thất bại và thời gian chạy mà hoàn toàn không ảnh hưởng đến cơ sở dữ liệu JSON thực tế nhờ sử dụng cơ chế tệp tin tạm thời cô lập.</w:t>
+      </w:r>
+    </w:p>
+    <w:p>
+      <w:pPr/>
     </w:p>
     <w:p>
       <w:r>

</xml_diff>